<commit_message>
feat: add network configuration scripts, Packet Tracer files, and CP1 exercise documents
</commit_message>
<xml_diff>
--- a/CP1/PRIMEIRA BATERIA DE EXERCICIOS.docx
+++ b/CP1/PRIMEIRA BATERIA DE EXERCICIOS.docx
@@ -18,6 +18,24 @@
           <w:u w:val="single"/>
         </w:rPr>
         <w:t>PRIMEIRA BATERIA DE EXERCICIOS</w:t>
+      </w:r>
+    </w:p>
+    <w:p>
+      <w:pPr>
+        <w:jc w:val="center"/>
+        <w:rPr>
+          <w:b/>
+          <w:bCs/>
+          <w:u w:val="single"/>
+        </w:rPr>
+      </w:pPr>
+      <w:r>
+        <w:rPr>
+          <w:b/>
+          <w:bCs/>
+          <w:u w:val="single"/>
+        </w:rPr>
+        <w:t>Paulo André Carminati 1TDCPV RM 570877</w:t>
       </w:r>
     </w:p>
     <w:p>
@@ -77,7 +95,21 @@
               <w:jc w:val="both"/>
             </w:pPr>
             <w:r>
-              <w:t>(     )  /24</w:t>
+              <w:t>(</w:t>
+            </w:r>
+            <w:r>
+              <w:t>3</w:t>
+            </w:r>
+            <w:r>
+              <w:t xml:space="preserve">  </w:t>
+            </w:r>
+            <w:proofErr w:type="gramStart"/>
+            <w:r>
+              <w:t xml:space="preserve">  )</w:t>
+            </w:r>
+            <w:proofErr w:type="gramEnd"/>
+            <w:r>
+              <w:t xml:space="preserve">  /24</w:t>
             </w:r>
           </w:p>
         </w:tc>
@@ -108,8 +140,24 @@
               <w:ind w:left="0"/>
               <w:jc w:val="both"/>
             </w:pPr>
-            <w:r>
-              <w:t>(     )  /16</w:t>
+            <w:proofErr w:type="gramStart"/>
+            <w:r>
+              <w:t xml:space="preserve">(  </w:t>
+            </w:r>
+            <w:r>
+              <w:t>1</w:t>
+            </w:r>
+            <w:proofErr w:type="gramEnd"/>
+            <w:r>
+              <w:t xml:space="preserve"> </w:t>
+            </w:r>
+            <w:proofErr w:type="gramStart"/>
+            <w:r>
+              <w:t xml:space="preserve">  )</w:t>
+            </w:r>
+            <w:proofErr w:type="gramEnd"/>
+            <w:r>
+              <w:t xml:space="preserve">  /16</w:t>
             </w:r>
           </w:p>
         </w:tc>
@@ -141,7 +189,21 @@
               <w:jc w:val="both"/>
             </w:pPr>
             <w:r>
-              <w:t>(     )    /8</w:t>
+              <w:t>(</w:t>
+            </w:r>
+            <w:r>
+              <w:t>2</w:t>
+            </w:r>
+            <w:r>
+              <w:t xml:space="preserve">  </w:t>
+            </w:r>
+            <w:proofErr w:type="gramStart"/>
+            <w:r>
+              <w:t xml:space="preserve">  )</w:t>
+            </w:r>
+            <w:proofErr w:type="gramEnd"/>
+            <w:r>
+              <w:t xml:space="preserve">    /8</w:t>
             </w:r>
           </w:p>
         </w:tc>
@@ -211,8 +273,24 @@
               <w:ind w:left="0"/>
               <w:jc w:val="both"/>
             </w:pPr>
-            <w:r>
-              <w:t xml:space="preserve">(     ) comando utilizado para verificar os </w:t>
+            <w:proofErr w:type="gramStart"/>
+            <w:r>
+              <w:t xml:space="preserve">( </w:t>
+            </w:r>
+            <w:r>
+              <w:t>2</w:t>
+            </w:r>
+            <w:proofErr w:type="gramEnd"/>
+            <w:r>
+              <w:t xml:space="preserve">  </w:t>
+            </w:r>
+            <w:proofErr w:type="gramStart"/>
+            <w:r>
+              <w:t xml:space="preserve">  )</w:t>
+            </w:r>
+            <w:proofErr w:type="gramEnd"/>
+            <w:r>
+              <w:t xml:space="preserve"> comando utilizado para verificar os </w:t>
             </w:r>
             <w:proofErr w:type="spellStart"/>
             <w:r>
@@ -256,8 +334,24 @@
               <w:ind w:left="0"/>
               <w:jc w:val="both"/>
             </w:pPr>
-            <w:r>
-              <w:t>(     ) comando utilizado para testar a conectividade entre dois dispositivos de rede</w:t>
+            <w:proofErr w:type="gramStart"/>
+            <w:r>
+              <w:t xml:space="preserve">(  </w:t>
+            </w:r>
+            <w:proofErr w:type="gramEnd"/>
+            <w:r>
+              <w:t xml:space="preserve">  </w:t>
+            </w:r>
+            <w:proofErr w:type="gramStart"/>
+            <w:r>
+              <w:t>4</w:t>
+            </w:r>
+            <w:r>
+              <w:t xml:space="preserve"> )</w:t>
+            </w:r>
+            <w:proofErr w:type="gramEnd"/>
+            <w:r>
+              <w:t xml:space="preserve"> comando utilizado para testar a conectividade entre dois dispositivos de rede</w:t>
             </w:r>
           </w:p>
         </w:tc>
@@ -288,8 +382,24 @@
               <w:ind w:left="0"/>
               <w:jc w:val="both"/>
             </w:pPr>
-            <w:r>
-              <w:t xml:space="preserve">(     ) comando utilizado para demonstrar as configurações da rede do </w:t>
+            <w:proofErr w:type="gramStart"/>
+            <w:r>
+              <w:t xml:space="preserve">(  </w:t>
+            </w:r>
+            <w:proofErr w:type="gramEnd"/>
+            <w:r>
+              <w:t xml:space="preserve"> </w:t>
+            </w:r>
+            <w:proofErr w:type="gramStart"/>
+            <w:r>
+              <w:t>1</w:t>
+            </w:r>
+            <w:r>
+              <w:t xml:space="preserve">  )</w:t>
+            </w:r>
+            <w:proofErr w:type="gramEnd"/>
+            <w:r>
+              <w:t xml:space="preserve"> comando utilizado para demonstrar as configurações da rede do </w:t>
             </w:r>
             <w:proofErr w:type="spellStart"/>
             <w:r>
@@ -325,8 +435,24 @@
               <w:ind w:left="0"/>
               <w:jc w:val="both"/>
             </w:pPr>
-            <w:r>
-              <w:t>(     ) comando utilizado para testar a conectividade entre dois computadores de forma intermitente</w:t>
+            <w:proofErr w:type="gramStart"/>
+            <w:r>
+              <w:t xml:space="preserve">(  </w:t>
+            </w:r>
+            <w:proofErr w:type="gramEnd"/>
+            <w:r>
+              <w:t xml:space="preserve"> </w:t>
+            </w:r>
+            <w:proofErr w:type="gramStart"/>
+            <w:r>
+              <w:t>3</w:t>
+            </w:r>
+            <w:r>
+              <w:t xml:space="preserve">  )</w:t>
+            </w:r>
+            <w:proofErr w:type="gramEnd"/>
+            <w:r>
+              <w:t xml:space="preserve"> comando utilizado para testar a conectividade entre dois computadores de forma intermitente</w:t>
             </w:r>
           </w:p>
         </w:tc>
@@ -359,8 +485,14 @@
           <w:numId w:val="4"/>
         </w:numPr>
         <w:jc w:val="both"/>
-      </w:pPr>
-      <w:r>
+        <w:rPr>
+          <w:color w:val="FF0000"/>
+        </w:rPr>
+      </w:pPr>
+      <w:r>
+        <w:rPr>
+          <w:color w:val="FF0000"/>
+        </w:rPr>
         <w:t>10.0.0.0</w:t>
       </w:r>
     </w:p>
@@ -568,8 +700,14 @@
           <w:numId w:val="4"/>
         </w:numPr>
         <w:jc w:val="both"/>
-      </w:pPr>
-      <w:r>
+        <w:rPr>
+          <w:color w:val="FF0000"/>
+        </w:rPr>
+      </w:pPr>
+      <w:r>
+        <w:rPr>
+          <w:color w:val="FF0000"/>
+        </w:rPr>
         <w:t>192.168.100.0</w:t>
       </w:r>
     </w:p>
@@ -628,8 +766,14 @@
           <w:numId w:val="4"/>
         </w:numPr>
         <w:jc w:val="both"/>
-      </w:pPr>
-      <w:r>
+        <w:rPr>
+          <w:color w:val="FF0000"/>
+        </w:rPr>
+      </w:pPr>
+      <w:r>
+        <w:rPr>
+          <w:color w:val="FF0000"/>
+        </w:rPr>
         <w:t>10.255.255.255</w:t>
       </w:r>
     </w:p>
@@ -669,6 +813,7 @@
         <w:jc w:val="both"/>
       </w:pPr>
       <w:r>
+        <w:lastRenderedPageBreak/>
         <w:t>10.34.255.255</w:t>
       </w:r>
     </w:p>
@@ -755,8 +900,14 @@
           <w:numId w:val="4"/>
         </w:numPr>
         <w:jc w:val="both"/>
-      </w:pPr>
-      <w:r>
+        <w:rPr>
+          <w:color w:val="FF0000"/>
+        </w:rPr>
+      </w:pPr>
+      <w:r>
+        <w:rPr>
+          <w:color w:val="FF0000"/>
+        </w:rPr>
         <w:t>192.168.255.255</w:t>
       </w:r>
     </w:p>
@@ -814,8 +965,14 @@
           <w:numId w:val="4"/>
         </w:numPr>
         <w:jc w:val="both"/>
-      </w:pPr>
-      <w:r>
+        <w:rPr>
+          <w:color w:val="FF0000"/>
+        </w:rPr>
+      </w:pPr>
+      <w:r>
+        <w:rPr>
+          <w:color w:val="FF0000"/>
+        </w:rPr>
         <w:t>172.19.255.255</w:t>
       </w:r>
     </w:p>
@@ -886,8 +1043,14 @@
           <w:numId w:val="4"/>
         </w:numPr>
         <w:jc w:val="both"/>
-      </w:pPr>
-      <w:r>
+        <w:rPr>
+          <w:color w:val="FF0000"/>
+        </w:rPr>
+      </w:pPr>
+      <w:r>
+        <w:rPr>
+          <w:color w:val="FF0000"/>
+        </w:rPr>
         <w:t>11.0.0.1</w:t>
       </w:r>
     </w:p>
@@ -899,8 +1062,14 @@
           <w:numId w:val="4"/>
         </w:numPr>
         <w:jc w:val="both"/>
-      </w:pPr>
-      <w:r>
+        <w:rPr>
+          <w:color w:val="FF0000"/>
+        </w:rPr>
+      </w:pPr>
+      <w:r>
+        <w:rPr>
+          <w:color w:val="FF0000"/>
+        </w:rPr>
         <w:t>10.245.278.244</w:t>
       </w:r>
     </w:p>
@@ -912,8 +1081,14 @@
           <w:numId w:val="4"/>
         </w:numPr>
         <w:jc w:val="both"/>
-      </w:pPr>
-      <w:r>
+        <w:rPr>
+          <w:color w:val="FF0000"/>
+        </w:rPr>
+      </w:pPr>
+      <w:r>
+        <w:rPr>
+          <w:color w:val="FF0000"/>
+        </w:rPr>
         <w:t>12.100.200.246</w:t>
       </w:r>
     </w:p>
@@ -979,8 +1154,14 @@
           <w:numId w:val="4"/>
         </w:numPr>
         <w:jc w:val="both"/>
-      </w:pPr>
-      <w:r>
+        <w:rPr>
+          <w:color w:val="FF0000"/>
+        </w:rPr>
+      </w:pPr>
+      <w:r>
+        <w:rPr>
+          <w:color w:val="FF0000"/>
+        </w:rPr>
         <w:t>172.19.0.200</w:t>
       </w:r>
     </w:p>
@@ -1005,8 +1186,14 @@
           <w:numId w:val="4"/>
         </w:numPr>
         <w:jc w:val="both"/>
-      </w:pPr>
-      <w:r>
+        <w:rPr>
+          <w:color w:val="FF0000"/>
+        </w:rPr>
+      </w:pPr>
+      <w:r>
+        <w:rPr>
+          <w:color w:val="FF0000"/>
+        </w:rPr>
         <w:t>172.19.200.245</w:t>
       </w:r>
     </w:p>
@@ -1031,8 +1218,14 @@
           <w:numId w:val="4"/>
         </w:numPr>
         <w:jc w:val="both"/>
-      </w:pPr>
-      <w:r>
+        <w:rPr>
+          <w:color w:val="FF0000"/>
+        </w:rPr>
+      </w:pPr>
+      <w:r>
+        <w:rPr>
+          <w:color w:val="FF0000"/>
+        </w:rPr>
         <w:t>172.19.255.254</w:t>
       </w:r>
     </w:p>
@@ -1168,8 +1361,14 @@
           <w:numId w:val="3"/>
         </w:numPr>
         <w:jc w:val="both"/>
-      </w:pPr>
-      <w:r>
+        <w:rPr>
+          <w:color w:val="FF0000"/>
+        </w:rPr>
+      </w:pPr>
+      <w:r>
+        <w:rPr>
+          <w:color w:val="FF0000"/>
+        </w:rPr>
         <w:t>192.168.100.1</w:t>
       </w:r>
     </w:p>

</xml_diff>